<commit_message>
Rebrand Bonus Pack PDFs to Teeco brand guide; verified accuracy fixes
- All 18 bonus PDFs restyled per the Teeco brand style guide: Source Serif
  Pro semibold headings, Raleway body/labels, black/gray/mocha/cream palette,
  rounded corners, thin gray rules, real teeco logo on page one and the
  logomark in running heads
- Extracted logo/logomark from the brand guide PDF; added build_bonus.py
- Accuracy pass against canon and manuscript: fixed the Scorecard walk-away
  rule count, the 5 Steps letter-mapping claim, added the book's estimate
  hedge to guest lifetime value; made two docs title-neutral
- Regenerated docx copies and the handoff zip

Co-Authored-By: Claude Fable 5 <noreply@anthropic.com>
Claude-Session: https://claude.ai/code/session_015nzsXVPus1uW1psxXwQoWk
</commit_message>
<xml_diff>
--- a/book/bonus/docx/5 Steps to Buying Your First Rental Property in 3 Months.docx
+++ b/book/bonus/docx/5 Steps to Buying Your First Rental Property in 3 Months.docx
@@ -16,7 +16,7 @@
         <w:pStyle w:val="FirstParagraph"/>
       </w:pPr>
       <w:r>
-        <w:t xml:space="preserve">The whole RURAL Method as a month-by-month buying roadmap. Five steps, five letters, one rule: follow them in order, every time. Most first deals die from doing the right steps in the wrong order. My business partner Ryu ran this exact sequence in twelve weeks, spreadsheet to launch, and Lookout Lodge grossed $83,937.81 in its first year live. The book’s own deal timeline runs the same way: 45 days to close, 30 days of light renovation if needed, guests within 90 days.</w:t>
+        <w:t xml:space="preserve">The whole RURAL Method as a month-by-month buying roadmap. Five steps, one rule: follow them in order, every time. Most first deals die from doing the right steps in the wrong order. My business partner Ryu ran this exact sequence in twelve weeks, spreadsheet to launch, and Lookout Lodge grossed $83,937.81 in its first year live. The book’s own deal timeline runs the same way: 45 days to close, 30 days of light renovation if needed, guests within 90 days.</w:t>
       </w:r>
     </w:p>
     <w:p>
@@ -30,7 +30,7 @@
     <w:tbl>
       <w:tblPr>
         <w:tblStyle w:val="Table"/>
-        <w:tblW w:type="pct" w:w="5000"/>
+        <w:tblW w:type="auto" w:w="0"/>
         <w:tblLook w:firstRow="1" w:lastRow="0" w:firstColumn="0" w:lastColumn="0" w:noHBand="0" w:noVBand="0" w:val="0020"/>
         <w:jc w:val="start"/>
       </w:tblPr>
@@ -238,7 +238,7 @@
               <w:jc w:val="left"/>
             </w:pPr>
             <w:r>
-              <w:t xml:space="preserve">U + R — Room for Everyone</w:t>
+              <w:t xml:space="preserve">R — Room for Everyone</w:t>
             </w:r>
           </w:p>
         </w:tc>
@@ -552,13 +552,13 @@
       </w:r>
     </w:p>
     <w:bookmarkEnd w:id="21"/>
-    <w:bookmarkStart w:id="22" w:name="Xf0671b64165f85ae0453306e27c39a4938e7b9e"/>
+    <w:bookmarkStart w:id="22" w:name="X1aad5d6f8cdf857ed5b871820d8ed792424cf84"/>
     <w:p>
       <w:pPr>
         <w:pStyle w:val="Heading2"/>
       </w:pPr>
       <w:r>
-        <w:t xml:space="preserve">Step 3 — Find the House and Negotiate (Weeks 5–8) · U + R</w:t>
+        <w:t xml:space="preserve">Step 3 — Find the House and Negotiate (Weeks 5–8) · R</w:t>
       </w:r>
     </w:p>
     <w:p>

</xml_diff>